<commit_message>
Chapter R3: referee number-check fixes
Referee agent verified every quantitative claim against chapter_stats.csv
(all headline peaks, stresses, displacements, pressure sweep, 4x4 matrix,
aspect-ratio, layer, weight, infinite-length matched; FA/EN in lock-step;
figures 4-1..4-22 clean). Two fixes applied:
- §4-11 no-pressure displacement 1.073 -> 1.072 (row G_NOPRESS = 1.07208;
  1.073 is the P=1 MPa base). Increment and hoop values already keyed to 1.072.
- §4-20 DPL=Fourier agreement nine -> eight significant digits
  (relative difference 3.4e-9). Rebuilt all three docx.

Co-Authored-By: Claude Opus 4.8 (1M context) <noreply@anthropic.com>
</commit_message>
<xml_diff>
--- a/claude/thesis_chapter/RESULTS_CHAPTER_EN_R3.docx
+++ b/claude/thesis_chapter/RESULTS_CHAPTER_EN_R3.docx
@@ -2273,7 +2273,7 @@
           <w:sz w:val="24"/>
           <w:szCs w:val="28"/>
         </w:rPr>
-        <w:t xml:space="preserve">The effect of the internal pressure is examined with a full pressure sweep at six values 0, 10, 30, 50, 70, and 100 MPa, so that the behavior is covered from low pressures to very high pressures. As shown in Figure 4-12, the temperature field remains practically independent of the internal pressure, because thermal and mechanical loading are linked only through the weak coupling term in the energy equation, and pressure is not a direct driver of temperature. By contrast, the mechanical response grows linearly with pressure: the peak dimensionless radial displacement rises from 1.073 with no pressure to 1.086, 1.115, 1.143, 1.171, and 1.214, respectively, with an increment of exactly 0.0283 per 20 MPa; this perfect linearity reflects the linear nature of the thermoelastic model employed.</w:t>
+        <w:t xml:space="preserve">The effect of the internal pressure is examined with a full pressure sweep at six values 0, 10, 30, 50, 70, and 100 MPa, so that the behavior is covered from low pressures to very high pressures. As shown in Figure 4-12, the temperature field remains practically independent of the internal pressure, because thermal and mechanical loading are linked only through the weak coupling term in the energy equation, and pressure is not a direct driver of temperature. By contrast, the mechanical response grows linearly with pressure: the peak dimensionless radial displacement rises from 1.072 with no pressure to 1.086, 1.115, 1.143, 1.171, and 1.214, respectively, with an increment of exactly 0.0283 per 20 MPa; this perfect linearity reflects the linear nature of the thermoelastic model employed.</w:t>
       </w:r>
     </w:p>
     <w:p>
@@ -3778,7 +3778,7 @@
           <w:sz w:val="24"/>
           <w:szCs w:val="28"/>
         </w:rPr>
-        <w:t xml:space="preserve">In the final extension study the reference problem is solved under four thermoelasticity theories with matched parameters: the classical coupled Fourier theory, the Lord-Shulman theory [4], the dual-phase-lag (DPL) theory [74] with τ_q = τ0 and the two values τ_T = τ_q/2 and τ_T = τ_q, and the Green-Naghdi type-III theory [67] with k* = k/τ0 (so that its wave speed equals the Lord-Shulman one). According to Figure 4-22, the peak mid-point temperatures order as: Fourier 0.991 = DPL(τ_T=τ_q) 0.991 &lt; DPL(τ_T=τ_q/2) 1.065 &lt; Green-Naghdi 1.151 &lt; Lord-Shulman 1.412. Two main observations follow. First, for τ_T = τ_q the DPL solution collapses onto the Fourier solution to nine significant digits — the numerical confirmation of the known analytical degeneracy of this theory — showing that DPL is meaningful only for τ_T &lt; τ_q, in which case it interpolates between Fourier and Lord-Shulman. Second, the Green-Naghdi theory exhibits an earlier but weaker front (peak at Fo ≈ 0.64) and a </w:t>
+        <w:t xml:space="preserve">In the final extension study the reference problem is solved under four thermoelasticity theories with matched parameters: the classical coupled Fourier theory, the Lord-Shulman theory [4], the dual-phase-lag (DPL) theory [74] with τ_q = τ0 and the two values τ_T = τ_q/2 and τ_T = τ_q, and the Green-Naghdi type-III theory [67] with k* = k/τ0 (so that its wave speed equals the Lord-Shulman one). According to Figure 4-22, the peak mid-point temperatures order as: Fourier 0.991 = DPL(τ_T=τ_q) 0.991 &lt; DPL(τ_T=τ_q/2) 1.065 &lt; Green-Naghdi 1.151 &lt; Lord-Shulman 1.412. Two main observations follow. First, for τ_T = τ_q the DPL solution collapses onto the Fourier solution to eight significant digits — the numerical confirmation of the known analytical degeneracy of this theory — showing that DPL is meaningful only for τ_T &lt; τ_q, in which case it interpolates between Fourier and Lord-Shulman. Second, the Green-Naghdi theory exhibits an earlier but weaker front (peak at Fo ≈ 0.64) and a </w:t>
       </w:r>
       <w:r>
         <w:rPr>

</xml_diff>